<commit_message>
Section parsing updated with new contracts
</commit_message>
<xml_diff>
--- a/Bank_Testing.docx
+++ b/Bank_Testing.docx
@@ -9,14 +9,17 @@
       <w:r>
         <w:t>Central Bank (fee amount to be separated to match debit)</w:t>
       </w:r>
+      <w:r>
+        <w:t>recheck</w:t>
+      </w:r>
     </w:p>
     <w:p>
       <w:r>
         <w:drawing>
-          <wp:inline distT="0" distB="0" distL="0" distR="0" wp14:anchorId="1B4B5FEF" wp14:editId="485391A3">
-            <wp:extent cx="5943600" cy="2453005"/>
-            <wp:effectExtent l="0" t="0" r="0" b="4445"/>
-            <wp:docPr id="1761569853" name="Picture 1"/>
+          <wp:inline distT="0" distB="0" distL="0" distR="0" wp14:anchorId="1B88EC3A" wp14:editId="50F57AAF">
+            <wp:extent cx="5943600" cy="2646045"/>
+            <wp:effectExtent l="0" t="0" r="0" b="1905"/>
+            <wp:docPr id="132317849" name="Picture 1"/>
             <wp:cNvGraphicFramePr>
               <a:graphicFrameLocks xmlns:a="http://schemas.openxmlformats.org/drawingml/2006/main" noChangeAspect="1"/>
             </wp:cNvGraphicFramePr>
@@ -24,7 +27,7 @@
               <a:graphicData uri="http://schemas.openxmlformats.org/drawingml/2006/picture">
                 <pic:pic xmlns:pic="http://schemas.openxmlformats.org/drawingml/2006/picture">
                   <pic:nvPicPr>
-                    <pic:cNvPr id="1761569853" name=""/>
+                    <pic:cNvPr id="132317849" name=""/>
                     <pic:cNvPicPr/>
                   </pic:nvPicPr>
                   <pic:blipFill>
@@ -36,7 +39,7 @@
                   <pic:spPr>
                     <a:xfrm>
                       <a:off x="0" y="0"/>
-                      <a:ext cx="5943600" cy="2453005"/>
+                      <a:ext cx="5943600" cy="2646045"/>
                     </a:xfrm>
                     <a:prstGeom prst="rect">
                       <a:avLst/>
@@ -51,30 +54,17 @@
     </w:p>
     <w:p/>
     <w:p>
-      <w:proofErr w:type="gramStart"/>
-      <w:r>
-        <w:t>Trustco(</w:t>
-      </w:r>
-      <w:proofErr w:type="gramEnd"/>
-      <w:r>
-        <w:t xml:space="preserve">sometimes mismatch in debit and interest amount to be </w:t>
-      </w:r>
-      <w:proofErr w:type="spellStart"/>
-      <w:r>
-        <w:t>seperated</w:t>
-      </w:r>
-      <w:proofErr w:type="spellEnd"/>
-      <w:r>
-        <w:t xml:space="preserve">) </w:t>
+      <w:r>
+        <w:t xml:space="preserve">Trustco(sometimes mismatch in debit and interest amount to be seperated) </w:t>
       </w:r>
     </w:p>
     <w:p>
       <w:r>
         <w:drawing>
-          <wp:inline distT="0" distB="0" distL="0" distR="0" wp14:anchorId="2DDB4333" wp14:editId="37C3721B">
-            <wp:extent cx="5943600" cy="2436495"/>
-            <wp:effectExtent l="0" t="0" r="0" b="1905"/>
-            <wp:docPr id="1018015266" name="Picture 1"/>
+          <wp:inline distT="0" distB="0" distL="0" distR="0" wp14:anchorId="1F3455C1" wp14:editId="474D3419">
+            <wp:extent cx="5943600" cy="2623820"/>
+            <wp:effectExtent l="0" t="0" r="0" b="5080"/>
+            <wp:docPr id="170876343" name="Picture 1"/>
             <wp:cNvGraphicFramePr>
               <a:graphicFrameLocks xmlns:a="http://schemas.openxmlformats.org/drawingml/2006/main" noChangeAspect="1"/>
             </wp:cNvGraphicFramePr>
@@ -82,7 +72,7 @@
               <a:graphicData uri="http://schemas.openxmlformats.org/drawingml/2006/picture">
                 <pic:pic xmlns:pic="http://schemas.openxmlformats.org/drawingml/2006/picture">
                   <pic:nvPicPr>
-                    <pic:cNvPr id="1018015266" name=""/>
+                    <pic:cNvPr id="170876343" name=""/>
                     <pic:cNvPicPr/>
                   </pic:nvPicPr>
                   <pic:blipFill>
@@ -94,7 +84,7 @@
                   <pic:spPr>
                     <a:xfrm>
                       <a:off x="0" y="0"/>
-                      <a:ext cx="5943600" cy="2436495"/>
+                      <a:ext cx="5943600" cy="2623820"/>
                     </a:xfrm>
                     <a:prstGeom prst="rect">
                       <a:avLst/>
@@ -113,25 +103,16 @@
     <w:p/>
     <w:p>
       <w:r>
-        <w:lastRenderedPageBreak/>
-        <w:t xml:space="preserve">Sun Coast (single account </w:t>
-      </w:r>
-      <w:proofErr w:type="gramStart"/>
-      <w:r>
-        <w:t>working ,</w:t>
-      </w:r>
-      <w:proofErr w:type="gramEnd"/>
-      <w:r>
-        <w:t xml:space="preserve"> multi account to be fixed). </w:t>
+        <w:t xml:space="preserve">Sun Coast (single account working , multi account to be fixed). </w:t>
       </w:r>
     </w:p>
     <w:p>
       <w:r>
         <w:drawing>
-          <wp:inline distT="0" distB="0" distL="0" distR="0" wp14:anchorId="64DAE847" wp14:editId="4C5D5115">
-            <wp:extent cx="5943600" cy="2496820"/>
+          <wp:inline distT="0" distB="0" distL="0" distR="0" wp14:anchorId="12C7E3AF" wp14:editId="21AC510C">
+            <wp:extent cx="5943600" cy="2520315"/>
             <wp:effectExtent l="0" t="0" r="0" b="0"/>
-            <wp:docPr id="825806096" name="Picture 1"/>
+            <wp:docPr id="1869738195" name="Picture 1"/>
             <wp:cNvGraphicFramePr>
               <a:graphicFrameLocks xmlns:a="http://schemas.openxmlformats.org/drawingml/2006/main" noChangeAspect="1"/>
             </wp:cNvGraphicFramePr>
@@ -139,7 +120,7 @@
               <a:graphicData uri="http://schemas.openxmlformats.org/drawingml/2006/picture">
                 <pic:pic xmlns:pic="http://schemas.openxmlformats.org/drawingml/2006/picture">
                   <pic:nvPicPr>
-                    <pic:cNvPr id="825806096" name=""/>
+                    <pic:cNvPr id="1869738195" name=""/>
                     <pic:cNvPicPr/>
                   </pic:nvPicPr>
                   <pic:blipFill>
@@ -151,7 +132,7 @@
                   <pic:spPr>
                     <a:xfrm>
                       <a:off x="0" y="0"/>
-                      <a:ext cx="5943600" cy="2496820"/>
+                      <a:ext cx="5943600" cy="2520315"/>
                     </a:xfrm>
                     <a:prstGeom prst="rect">
                       <a:avLst/>
@@ -173,10 +154,10 @@
     <w:p>
       <w:r>
         <w:drawing>
-          <wp:inline distT="0" distB="0" distL="0" distR="0" wp14:anchorId="066CBBCC" wp14:editId="4FC73D41">
-            <wp:extent cx="5943600" cy="2447925"/>
-            <wp:effectExtent l="0" t="0" r="0" b="9525"/>
-            <wp:docPr id="711996561" name="Picture 1"/>
+          <wp:inline distT="0" distB="0" distL="0" distR="0" wp14:anchorId="16C763E8" wp14:editId="7F893F42">
+            <wp:extent cx="5943600" cy="2632710"/>
+            <wp:effectExtent l="0" t="0" r="0" b="0"/>
+            <wp:docPr id="882373081" name="Picture 1"/>
             <wp:cNvGraphicFramePr>
               <a:graphicFrameLocks xmlns:a="http://schemas.openxmlformats.org/drawingml/2006/main" noChangeAspect="1"/>
             </wp:cNvGraphicFramePr>
@@ -184,7 +165,7 @@
               <a:graphicData uri="http://schemas.openxmlformats.org/drawingml/2006/picture">
                 <pic:pic xmlns:pic="http://schemas.openxmlformats.org/drawingml/2006/picture">
                   <pic:nvPicPr>
-                    <pic:cNvPr id="711996561" name=""/>
+                    <pic:cNvPr id="882373081" name=""/>
                     <pic:cNvPicPr/>
                   </pic:nvPicPr>
                   <pic:blipFill>
@@ -196,7 +177,7 @@
                   <pic:spPr>
                     <a:xfrm>
                       <a:off x="0" y="0"/>
-                      <a:ext cx="5943600" cy="2447925"/>
+                      <a:ext cx="5943600" cy="2632710"/>
                     </a:xfrm>
                     <a:prstGeom prst="rect">
                       <a:avLst/>
@@ -217,17 +198,16 @@
     <w:p/>
     <w:p>
       <w:r>
-        <w:lastRenderedPageBreak/>
         <w:t>Home Bank (Mismatch due to some long description failing to add to transactions, need fix)</w:t>
       </w:r>
     </w:p>
     <w:p>
       <w:r>
         <w:drawing>
-          <wp:inline distT="0" distB="0" distL="0" distR="0" wp14:anchorId="16840687" wp14:editId="6B7617CD">
-            <wp:extent cx="5943600" cy="2442845"/>
+          <wp:inline distT="0" distB="0" distL="0" distR="0" wp14:anchorId="51098AE7" wp14:editId="1B1C111B">
+            <wp:extent cx="5943600" cy="2637155"/>
             <wp:effectExtent l="0" t="0" r="0" b="0"/>
-            <wp:docPr id="207110603" name="Picture 1"/>
+            <wp:docPr id="24560547" name="Picture 1"/>
             <wp:cNvGraphicFramePr>
               <a:graphicFrameLocks xmlns:a="http://schemas.openxmlformats.org/drawingml/2006/main" noChangeAspect="1"/>
             </wp:cNvGraphicFramePr>
@@ -235,7 +215,7 @@
               <a:graphicData uri="http://schemas.openxmlformats.org/drawingml/2006/picture">
                 <pic:pic xmlns:pic="http://schemas.openxmlformats.org/drawingml/2006/picture">
                   <pic:nvPicPr>
-                    <pic:cNvPr id="207110603" name=""/>
+                    <pic:cNvPr id="24560547" name=""/>
                     <pic:cNvPicPr/>
                   </pic:nvPicPr>
                   <pic:blipFill>
@@ -247,7 +227,7 @@
                   <pic:spPr>
                     <a:xfrm>
                       <a:off x="0" y="0"/>
-                      <a:ext cx="5943600" cy="2442845"/>
+                      <a:ext cx="5943600" cy="2637155"/>
                     </a:xfrm>
                     <a:prstGeom prst="rect">
                       <a:avLst/>
@@ -269,10 +249,10 @@
     <w:p>
       <w:r>
         <w:drawing>
-          <wp:inline distT="0" distB="0" distL="0" distR="0" wp14:anchorId="6F70CBDF" wp14:editId="7C357C2B">
-            <wp:extent cx="5943600" cy="2638425"/>
-            <wp:effectExtent l="0" t="0" r="0" b="9525"/>
-            <wp:docPr id="1526816564" name="Picture 1"/>
+          <wp:inline distT="0" distB="0" distL="0" distR="0" wp14:anchorId="241C653A" wp14:editId="279DFA20">
+            <wp:extent cx="5943600" cy="2701290"/>
+            <wp:effectExtent l="0" t="0" r="0" b="3810"/>
+            <wp:docPr id="40702650" name="Picture 1"/>
             <wp:cNvGraphicFramePr>
               <a:graphicFrameLocks xmlns:a="http://schemas.openxmlformats.org/drawingml/2006/main" noChangeAspect="1"/>
             </wp:cNvGraphicFramePr>
@@ -280,7 +260,7 @@
               <a:graphicData uri="http://schemas.openxmlformats.org/drawingml/2006/picture">
                 <pic:pic xmlns:pic="http://schemas.openxmlformats.org/drawingml/2006/picture">
                   <pic:nvPicPr>
-                    <pic:cNvPr id="1526816564" name=""/>
+                    <pic:cNvPr id="40702650" name=""/>
                     <pic:cNvPicPr/>
                   </pic:nvPicPr>
                   <pic:blipFill>
@@ -292,7 +272,7 @@
                   <pic:spPr>
                     <a:xfrm>
                       <a:off x="0" y="0"/>
-                      <a:ext cx="5943600" cy="2638425"/>
+                      <a:ext cx="5943600" cy="2701290"/>
                     </a:xfrm>
                     <a:prstGeom prst="rect">
                       <a:avLst/>
@@ -309,17 +289,17 @@
     <w:p>
       <w:r>
         <w:lastRenderedPageBreak/>
-        <w:t xml:space="preserve">German American </w:t>
+        <w:t>German American</w:t>
       </w:r>
       <w:r>
         <w:br/>
       </w:r>
       <w:r>
         <w:drawing>
-          <wp:inline distT="0" distB="0" distL="0" distR="0" wp14:anchorId="572F34C5" wp14:editId="375C2F19">
-            <wp:extent cx="5943600" cy="2435860"/>
-            <wp:effectExtent l="0" t="0" r="0" b="2540"/>
-            <wp:docPr id="775751912" name="Picture 1"/>
+          <wp:inline distT="0" distB="0" distL="0" distR="0" wp14:anchorId="0FC25861" wp14:editId="6EFDEA21">
+            <wp:extent cx="5943600" cy="2682875"/>
+            <wp:effectExtent l="0" t="0" r="0" b="3175"/>
+            <wp:docPr id="1541170320" name="Picture 1"/>
             <wp:cNvGraphicFramePr>
               <a:graphicFrameLocks xmlns:a="http://schemas.openxmlformats.org/drawingml/2006/main" noChangeAspect="1"/>
             </wp:cNvGraphicFramePr>
@@ -327,7 +307,7 @@
               <a:graphicData uri="http://schemas.openxmlformats.org/drawingml/2006/picture">
                 <pic:pic xmlns:pic="http://schemas.openxmlformats.org/drawingml/2006/picture">
                   <pic:nvPicPr>
-                    <pic:cNvPr id="775751912" name=""/>
+                    <pic:cNvPr id="1541170320" name=""/>
                     <pic:cNvPicPr/>
                   </pic:nvPicPr>
                   <pic:blipFill>
@@ -339,7 +319,7 @@
                   <pic:spPr>
                     <a:xfrm>
                       <a:off x="0" y="0"/>
-                      <a:ext cx="5943600" cy="2435860"/>
+                      <a:ext cx="5943600" cy="2682875"/>
                     </a:xfrm>
                     <a:prstGeom prst="rect">
                       <a:avLst/>
@@ -361,10 +341,10 @@
     <w:p>
       <w:r>
         <w:drawing>
-          <wp:inline distT="0" distB="0" distL="0" distR="0" wp14:anchorId="6D1046CE" wp14:editId="25493A41">
-            <wp:extent cx="5943600" cy="2600960"/>
-            <wp:effectExtent l="0" t="0" r="0" b="8890"/>
-            <wp:docPr id="854564346" name="Picture 1"/>
+          <wp:inline distT="0" distB="0" distL="0" distR="0" wp14:anchorId="2ECF2FEE" wp14:editId="6FE66D3E">
+            <wp:extent cx="5943600" cy="2592070"/>
+            <wp:effectExtent l="0" t="0" r="0" b="0"/>
+            <wp:docPr id="1431197093" name="Picture 1"/>
             <wp:cNvGraphicFramePr>
               <a:graphicFrameLocks xmlns:a="http://schemas.openxmlformats.org/drawingml/2006/main" noChangeAspect="1"/>
             </wp:cNvGraphicFramePr>
@@ -372,7 +352,7 @@
               <a:graphicData uri="http://schemas.openxmlformats.org/drawingml/2006/picture">
                 <pic:pic xmlns:pic="http://schemas.openxmlformats.org/drawingml/2006/picture">
                   <pic:nvPicPr>
-                    <pic:cNvPr id="854564346" name=""/>
+                    <pic:cNvPr id="1431197093" name=""/>
                     <pic:cNvPicPr/>
                   </pic:nvPicPr>
                   <pic:blipFill>
@@ -384,7 +364,7 @@
                   <pic:spPr>
                     <a:xfrm>
                       <a:off x="0" y="0"/>
-                      <a:ext cx="5943600" cy="2600960"/>
+                      <a:ext cx="5943600" cy="2592070"/>
                     </a:xfrm>
                     <a:prstGeom prst="rect">
                       <a:avLst/>
@@ -404,12 +384,10 @@
     <w:p/>
     <w:p/>
     <w:p>
-      <w:proofErr w:type="spellStart"/>
       <w:r>
         <w:lastRenderedPageBreak/>
         <w:t>Americu</w:t>
       </w:r>
-      <w:proofErr w:type="spellEnd"/>
       <w:r>
         <w:t xml:space="preserve"> (debit credit mismatch to be checked)</w:t>
       </w:r>
@@ -417,10 +395,10 @@
     <w:p>
       <w:r>
         <w:drawing>
-          <wp:inline distT="0" distB="0" distL="0" distR="0" wp14:anchorId="5664E06B" wp14:editId="30D6DFD2">
-            <wp:extent cx="5943600" cy="2540635"/>
+          <wp:inline distT="0" distB="0" distL="0" distR="0" wp14:anchorId="62DD16B8" wp14:editId="2F73ED3C">
+            <wp:extent cx="5943600" cy="2693670"/>
             <wp:effectExtent l="0" t="0" r="0" b="0"/>
-            <wp:docPr id="1288768754" name="Picture 1"/>
+            <wp:docPr id="515612690" name="Picture 1"/>
             <wp:cNvGraphicFramePr>
               <a:graphicFrameLocks xmlns:a="http://schemas.openxmlformats.org/drawingml/2006/main" noChangeAspect="1"/>
             </wp:cNvGraphicFramePr>
@@ -428,7 +406,7 @@
               <a:graphicData uri="http://schemas.openxmlformats.org/drawingml/2006/picture">
                 <pic:pic xmlns:pic="http://schemas.openxmlformats.org/drawingml/2006/picture">
                   <pic:nvPicPr>
-                    <pic:cNvPr id="1288768754" name=""/>
+                    <pic:cNvPr id="515612690" name=""/>
                     <pic:cNvPicPr/>
                   </pic:nvPicPr>
                   <pic:blipFill>
@@ -440,7 +418,7 @@
                   <pic:spPr>
                     <a:xfrm>
                       <a:off x="0" y="0"/>
-                      <a:ext cx="5943600" cy="2540635"/>
+                      <a:ext cx="5943600" cy="2693670"/>
                     </a:xfrm>
                     <a:prstGeom prst="rect">
                       <a:avLst/>
@@ -456,24 +434,16 @@
     <w:p/>
     <w:p>
       <w:r>
-        <w:t xml:space="preserve">Middle Town </w:t>
-      </w:r>
-      <w:proofErr w:type="gramStart"/>
-      <w:r>
-        <w:t>Valley(</w:t>
-      </w:r>
-      <w:proofErr w:type="gramEnd"/>
-      <w:r>
-        <w:t>Debit credit mismatch due to long description)</w:t>
+        <w:t>Middle Town Valley(Debit credit mismatch due to long description)</w:t>
       </w:r>
     </w:p>
     <w:p>
       <w:r>
         <w:drawing>
-          <wp:inline distT="0" distB="0" distL="0" distR="0" wp14:anchorId="4E2CDCFF" wp14:editId="2C56A175">
-            <wp:extent cx="5943600" cy="2613025"/>
-            <wp:effectExtent l="0" t="0" r="0" b="0"/>
-            <wp:docPr id="1356485653" name="Picture 1"/>
+          <wp:inline distT="0" distB="0" distL="0" distR="0" wp14:anchorId="42A8AC5A" wp14:editId="73759555">
+            <wp:extent cx="5943600" cy="2606040"/>
+            <wp:effectExtent l="0" t="0" r="0" b="3810"/>
+            <wp:docPr id="397849331" name="Picture 1"/>
             <wp:cNvGraphicFramePr>
               <a:graphicFrameLocks xmlns:a="http://schemas.openxmlformats.org/drawingml/2006/main" noChangeAspect="1"/>
             </wp:cNvGraphicFramePr>
@@ -481,7 +451,7 @@
               <a:graphicData uri="http://schemas.openxmlformats.org/drawingml/2006/picture">
                 <pic:pic xmlns:pic="http://schemas.openxmlformats.org/drawingml/2006/picture">
                   <pic:nvPicPr>
-                    <pic:cNvPr id="1356485653" name=""/>
+                    <pic:cNvPr id="397849331" name=""/>
                     <pic:cNvPicPr/>
                   </pic:nvPicPr>
                   <pic:blipFill>
@@ -493,7 +463,7 @@
                   <pic:spPr>
                     <a:xfrm>
                       <a:off x="0" y="0"/>
-                      <a:ext cx="5943600" cy="2613025"/>
+                      <a:ext cx="5943600" cy="2606040"/>
                     </a:xfrm>
                     <a:prstGeom prst="rect">
                       <a:avLst/>
@@ -511,20 +481,25 @@
     <w:p/>
     <w:p/>
     <w:p/>
-    <w:p/>
     <w:p>
       <w:r>
         <w:lastRenderedPageBreak/>
-        <w:t>Atlantic FCU (multi account to be fixed)</w:t>
+        <w:t>Atlantic FCU (</w:t>
+      </w:r>
+      <w:r>
+        <w:t>start balance and end balance to be mapped correctly</w:t>
+      </w:r>
+      <w:r>
+        <w:t>)</w:t>
       </w:r>
     </w:p>
     <w:p>
       <w:r>
         <w:drawing>
-          <wp:inline distT="0" distB="0" distL="0" distR="0" wp14:anchorId="522DD923" wp14:editId="21D41995">
-            <wp:extent cx="5943600" cy="2461895"/>
+          <wp:inline distT="0" distB="0" distL="0" distR="0" wp14:anchorId="6FE38DA3" wp14:editId="4BA5C4D8">
+            <wp:extent cx="5943600" cy="2538730"/>
             <wp:effectExtent l="0" t="0" r="0" b="0"/>
-            <wp:docPr id="225660311" name="Picture 1"/>
+            <wp:docPr id="741150516" name="Picture 1"/>
             <wp:cNvGraphicFramePr>
               <a:graphicFrameLocks xmlns:a="http://schemas.openxmlformats.org/drawingml/2006/main" noChangeAspect="1"/>
             </wp:cNvGraphicFramePr>
@@ -532,7 +507,7 @@
               <a:graphicData uri="http://schemas.openxmlformats.org/drawingml/2006/picture">
                 <pic:pic xmlns:pic="http://schemas.openxmlformats.org/drawingml/2006/picture">
                   <pic:nvPicPr>
-                    <pic:cNvPr id="225660311" name=""/>
+                    <pic:cNvPr id="741150516" name=""/>
                     <pic:cNvPicPr/>
                   </pic:nvPicPr>
                   <pic:blipFill>
@@ -544,7 +519,7 @@
                   <pic:spPr>
                     <a:xfrm>
                       <a:off x="0" y="0"/>
-                      <a:ext cx="5943600" cy="2461895"/>
+                      <a:ext cx="5943600" cy="2538730"/>
                     </a:xfrm>
                     <a:prstGeom prst="rect">
                       <a:avLst/>
@@ -559,22 +534,30 @@
     </w:p>
     <w:p/>
     <w:p>
-      <w:proofErr w:type="gramStart"/>
-      <w:r>
-        <w:t>DCU :</w:t>
-      </w:r>
-      <w:proofErr w:type="gramEnd"/>
-      <w:r>
-        <w:t xml:space="preserve"> (multi account to be fixed)</w:t>
-      </w:r>
-    </w:p>
-    <w:p>
-      <w:r>
+      <w:r>
+        <w:t>DCU : (multi account to be fixed)</w:t>
+      </w:r>
+      <w:r>
+        <w:t xml:space="preserve"> - Recheck</w:t>
+      </w:r>
+    </w:p>
+    <w:p>
+      <w:pPr>
+        <w:rPr>
+          <w:b/>
+          <w:bCs/>
+        </w:rPr>
+      </w:pPr>
+      <w:r>
+        <w:rPr>
+          <w:b/>
+          <w:bCs/>
+        </w:rPr>
         <w:drawing>
-          <wp:inline distT="0" distB="0" distL="0" distR="0" wp14:anchorId="12BD8F29" wp14:editId="41590A65">
-            <wp:extent cx="5943600" cy="2481580"/>
-            <wp:effectExtent l="0" t="0" r="0" b="0"/>
-            <wp:docPr id="838360628" name="Picture 1"/>
+          <wp:inline distT="0" distB="0" distL="0" distR="0" wp14:anchorId="3A80CFE8" wp14:editId="660D8E47">
+            <wp:extent cx="5943600" cy="2625725"/>
+            <wp:effectExtent l="0" t="0" r="0" b="3175"/>
+            <wp:docPr id="249155978" name="Picture 1"/>
             <wp:cNvGraphicFramePr>
               <a:graphicFrameLocks xmlns:a="http://schemas.openxmlformats.org/drawingml/2006/main" noChangeAspect="1"/>
             </wp:cNvGraphicFramePr>
@@ -582,7 +565,7 @@
               <a:graphicData uri="http://schemas.openxmlformats.org/drawingml/2006/picture">
                 <pic:pic xmlns:pic="http://schemas.openxmlformats.org/drawingml/2006/picture">
                   <pic:nvPicPr>
-                    <pic:cNvPr id="838360628" name=""/>
+                    <pic:cNvPr id="249155978" name=""/>
                     <pic:cNvPicPr/>
                   </pic:nvPicPr>
                   <pic:blipFill>
@@ -594,7 +577,7 @@
                   <pic:spPr>
                     <a:xfrm>
                       <a:off x="0" y="0"/>
-                      <a:ext cx="5943600" cy="2481580"/>
+                      <a:ext cx="5943600" cy="2625725"/>
                     </a:xfrm>
                     <a:prstGeom prst="rect">
                       <a:avLst/>
@@ -618,11 +601,9 @@
         <w:lastRenderedPageBreak/>
         <w:t xml:space="preserve">Lili Bank: (fee to be </w:t>
       </w:r>
-      <w:proofErr w:type="spellStart"/>
-      <w:r>
-        <w:t>seperated</w:t>
-      </w:r>
-      <w:proofErr w:type="spellEnd"/>
+      <w:r>
+        <w:t>separated</w:t>
+      </w:r>
       <w:r>
         <w:t>)</w:t>
       </w:r>
@@ -630,10 +611,10 @@
     <w:p>
       <w:r>
         <w:drawing>
-          <wp:inline distT="0" distB="0" distL="0" distR="0" wp14:anchorId="19316087" wp14:editId="62178DEB">
-            <wp:extent cx="5943600" cy="2489835"/>
-            <wp:effectExtent l="0" t="0" r="0" b="5715"/>
-            <wp:docPr id="2014219274" name="Picture 1"/>
+          <wp:inline distT="0" distB="0" distL="0" distR="0" wp14:anchorId="362B9EC1" wp14:editId="55941D39">
+            <wp:extent cx="5943600" cy="2642870"/>
+            <wp:effectExtent l="0" t="0" r="0" b="5080"/>
+            <wp:docPr id="493437240" name="Picture 1"/>
             <wp:cNvGraphicFramePr>
               <a:graphicFrameLocks xmlns:a="http://schemas.openxmlformats.org/drawingml/2006/main" noChangeAspect="1"/>
             </wp:cNvGraphicFramePr>
@@ -641,7 +622,7 @@
               <a:graphicData uri="http://schemas.openxmlformats.org/drawingml/2006/picture">
                 <pic:pic xmlns:pic="http://schemas.openxmlformats.org/drawingml/2006/picture">
                   <pic:nvPicPr>
-                    <pic:cNvPr id="2014219274" name=""/>
+                    <pic:cNvPr id="493437240" name=""/>
                     <pic:cNvPicPr/>
                   </pic:nvPicPr>
                   <pic:blipFill>
@@ -653,7 +634,7 @@
                   <pic:spPr>
                     <a:xfrm>
                       <a:off x="0" y="0"/>
-                      <a:ext cx="5943600" cy="2489835"/>
+                      <a:ext cx="5943600" cy="2642870"/>
                     </a:xfrm>
                     <a:prstGeom prst="rect">
                       <a:avLst/>
@@ -697,7 +678,7 @@
           <v:shape id="_x0000_i1025" type="#_x0000_t75" style="width:75.85pt;height:49.3pt" o:ole="">
             <v:imagedata r:id="rId17" o:title=""/>
           </v:shape>
-          <o:OLEObject Type="Embed" ProgID="Package" ShapeID="_x0000_i1025" DrawAspect="Icon" ObjectID="_1831671270" r:id="rId18"/>
+          <o:OLEObject Type="Embed" ProgID="Package" ShapeID="_x0000_i1025" DrawAspect="Icon" ObjectID="_1831800973" r:id="rId18"/>
         </w:object>
       </w:r>
       <w:r>
@@ -705,7 +686,7 @@
           <v:shape id="_x0000_i1026" type="#_x0000_t75" style="width:75.85pt;height:49.3pt" o:ole="">
             <v:imagedata r:id="rId19" o:title=""/>
           </v:shape>
-          <o:OLEObject Type="Embed" ProgID="Package" ShapeID="_x0000_i1026" DrawAspect="Icon" ObjectID="_1831671271" r:id="rId20"/>
+          <o:OLEObject Type="Embed" ProgID="Package" ShapeID="_x0000_i1026" DrawAspect="Icon" ObjectID="_1831800974" r:id="rId20"/>
         </w:object>
       </w:r>
     </w:p>

</xml_diff>

<commit_message>
doc and excel updated
</commit_message>
<xml_diff>
--- a/Bank_Testing.docx
+++ b/Bank_Testing.docx
@@ -207,7 +207,64 @@
     <w:p>
       <w:r>
         <w:lastRenderedPageBreak/>
-        <w:t>Numerica (single account working, multi account to be checked)</w:t>
+        <w:t xml:space="preserve">Numerica (multi account </w:t>
+      </w:r>
+      <w:r>
+        <w:t>not splitting by Account</w:t>
+      </w:r>
+      <w:r>
+        <w:t>)</w:t>
+      </w:r>
+    </w:p>
+    <w:p>
+      <w:r>
+        <w:drawing>
+          <wp:inline distT="0" distB="0" distL="0" distR="0" wp14:anchorId="1AA5BA3C" wp14:editId="7B308A3A">
+            <wp:extent cx="5943600" cy="2637790"/>
+            <wp:effectExtent l="0" t="0" r="0" b="0"/>
+            <wp:docPr id="1786936063" name="Picture 1"/>
+            <wp:cNvGraphicFramePr>
+              <a:graphicFrameLocks xmlns:a="http://schemas.openxmlformats.org/drawingml/2006/main" noChangeAspect="1"/>
+            </wp:cNvGraphicFramePr>
+            <a:graphic xmlns:a="http://schemas.openxmlformats.org/drawingml/2006/main">
+              <a:graphicData uri="http://schemas.openxmlformats.org/drawingml/2006/picture">
+                <pic:pic xmlns:pic="http://schemas.openxmlformats.org/drawingml/2006/picture">
+                  <pic:nvPicPr>
+                    <pic:cNvPr id="1786936063" name=""/>
+                    <pic:cNvPicPr/>
+                  </pic:nvPicPr>
+                  <pic:blipFill>
+                    <a:blip r:embed="rId8"/>
+                    <a:stretch>
+                      <a:fillRect/>
+                    </a:stretch>
+                  </pic:blipFill>
+                  <pic:spPr>
+                    <a:xfrm>
+                      <a:off x="0" y="0"/>
+                      <a:ext cx="5943600" cy="2637790"/>
+                    </a:xfrm>
+                    <a:prstGeom prst="rect">
+                      <a:avLst/>
+                    </a:prstGeom>
+                  </pic:spPr>
+                </pic:pic>
+              </a:graphicData>
+            </a:graphic>
+          </wp:inline>
+        </w:drawing>
+      </w:r>
+    </w:p>
+    <w:p/>
+    <w:p>
+      <w:r>
+        <w:t>Numerica (</w:t>
+      </w:r>
+      <w:r>
+        <w:t>Single account working</w:t>
+      </w:r>
+      <w:r>
+        <w:t>)</w:t>
       </w:r>
     </w:p>
     <w:p>
@@ -228,7 +285,7 @@
                     <pic:cNvPicPr/>
                   </pic:nvPicPr>
                   <pic:blipFill>
-                    <a:blip r:embed="rId8"/>
+                    <a:blip r:embed="rId9"/>
                     <a:stretch>
                       <a:fillRect/>
                     </a:stretch>
@@ -255,6 +312,7 @@
     <w:p/>
     <w:p/>
     <w:p/>
+    <w:p/>
     <w:p>
       <w:r>
         <w:t>Home Bank (Mismatch due to some long description failing to add to transactions, need fix)</w:t>
@@ -278,7 +336,7 @@
                     <pic:cNvPicPr/>
                   </pic:nvPicPr>
                   <pic:blipFill>
-                    <a:blip r:embed="rId9"/>
+                    <a:blip r:embed="rId10"/>
                     <a:stretch>
                       <a:fillRect/>
                     </a:stretch>
@@ -323,7 +381,7 @@
                     <pic:cNvPicPr/>
                   </pic:nvPicPr>
                   <pic:blipFill>
-                    <a:blip r:embed="rId10"/>
+                    <a:blip r:embed="rId11"/>
                     <a:stretch>
                       <a:fillRect/>
                     </a:stretch>
@@ -347,6 +405,7 @@
     <w:p/>
     <w:p>
       <w:r>
+        <w:lastRenderedPageBreak/>
         <w:t>German American</w:t>
       </w:r>
       <w:r>
@@ -369,7 +428,7 @@
                     <pic:cNvPicPr/>
                   </pic:nvPicPr>
                   <pic:blipFill>
-                    <a:blip r:embed="rId11"/>
+                    <a:blip r:embed="rId12"/>
                     <a:stretch>
                       <a:fillRect/>
                     </a:stretch>
@@ -396,7 +455,6 @@
     <w:p/>
     <w:p>
       <w:r>
-        <w:lastRenderedPageBreak/>
         <w:t xml:space="preserve">Safe Credit Union </w:t>
       </w:r>
     </w:p>
@@ -418,7 +476,7 @@
                     <pic:cNvPicPr/>
                   </pic:nvPicPr>
                   <pic:blipFill>
-                    <a:blip r:embed="rId12"/>
+                    <a:blip r:embed="rId13"/>
                     <a:stretch>
                       <a:fillRect/>
                     </a:stretch>
@@ -471,7 +529,7 @@
                     <pic:cNvPicPr/>
                   </pic:nvPicPr>
                   <pic:blipFill>
-                    <a:blip r:embed="rId13"/>
+                    <a:blip r:embed="rId14"/>
                     <a:stretch>
                       <a:fillRect/>
                     </a:stretch>
@@ -516,7 +574,7 @@
                     <pic:cNvPicPr/>
                   </pic:nvPicPr>
                   <pic:blipFill>
-                    <a:blip r:embed="rId14"/>
+                    <a:blip r:embed="rId15"/>
                     <a:stretch>
                       <a:fillRect/>
                     </a:stretch>
@@ -576,7 +634,7 @@
                 <wp:cNvGraphicFramePr/>
                 <a:graphic xmlns:a="http://schemas.openxmlformats.org/drawingml/2006/main">
                   <a:graphicData uri="http://schemas.microsoft.com/office/word/2010/wordprocessingInk">
-                    <w14:contentPart bwMode="auto" r:id="rId15">
+                    <w14:contentPart bwMode="auto" r:id="rId16">
                       <w14:nvContentPartPr>
                         <w14:cNvContentPartPr/>
                       </w14:nvContentPartPr>
@@ -592,7 +650,7 @@
           </mc:Choice>
           <mc:Fallback>
             <w:pict>
-              <v:shapetype w14:anchorId="54EE9F14" id="_x0000_t75" coordsize="21600,21600" o:spt="75" o:preferrelative="t" path="m@4@5l@4@11@9@11@9@5xe" filled="f" stroked="f">
+              <v:shapetype w14:anchorId="44A339AD" id="_x0000_t75" coordsize="21600,21600" o:spt="75" o:preferrelative="t" path="m@4@5l@4@11@9@11@9@5xe" filled="f" stroked="f">
                 <v:stroke joinstyle="miter"/>
                 <v:formulas>
                   <v:f eqn="if lineDrawn pixelLineWidth 0"/>
@@ -612,7 +670,7 @@
                 <o:lock v:ext="edit" aspectratio="t"/>
               </v:shapetype>
               <v:shape id="Ink 1" o:spid="_x0000_s1026" type="#_x0000_t75" style="position:absolute;margin-left:343.55pt;margin-top:11.05pt;width:82.2pt;height:27.5pt;z-index:251659264;visibility:visible;mso-wrap-style:square;mso-wrap-distance-left:9pt;mso-wrap-distance-top:0;mso-wrap-distance-right:9pt;mso-wrap-distance-bottom:0;mso-position-horizontal:absolute;mso-position-horizontal-relative:text;mso-position-vertical:absolute;mso-position-vertical-relative:text" o:gfxdata="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">
-                <v:imagedata r:id="rId16" o:title=""/>
+                <v:imagedata r:id="rId17" o:title=""/>
               </v:shape>
             </w:pict>
           </mc:Fallback>
@@ -635,7 +693,7 @@
                     <pic:cNvPicPr/>
                   </pic:nvPicPr>
                   <pic:blipFill>
-                    <a:blip r:embed="rId17"/>
+                    <a:blip r:embed="rId18"/>
                     <a:stretch>
                       <a:fillRect/>
                     </a:stretch>
@@ -659,7 +717,6 @@
     <w:p/>
     <w:p>
       <w:r>
-        <w:lastRenderedPageBreak/>
         <w:t>DCU : (</w:t>
       </w:r>
       <w:r>
@@ -697,7 +754,7 @@
                     <pic:cNvPicPr/>
                   </pic:nvPicPr>
                   <pic:blipFill>
-                    <a:blip r:embed="rId18"/>
+                    <a:blip r:embed="rId19"/>
                     <a:stretch>
                       <a:fillRect/>
                     </a:stretch>
@@ -752,6 +809,7 @@
           <w:b/>
           <w:bCs/>
         </w:rPr>
+        <w:lastRenderedPageBreak/>
         <w:drawing>
           <wp:inline distT="0" distB="0" distL="0" distR="0" wp14:anchorId="6446ECFD" wp14:editId="112B6A83">
             <wp:extent cx="5943600" cy="2513965"/>
@@ -768,7 +826,7 @@
                     <pic:cNvPicPr/>
                   </pic:nvPicPr>
                   <pic:blipFill>
-                    <a:blip r:embed="rId19"/>
+                    <a:blip r:embed="rId20"/>
                     <a:stretch>
                       <a:fillRect/>
                     </a:stretch>
@@ -799,25 +857,25 @@
       <w:r>
         <w:object w:dxaOrig="1520" w:dyaOrig="987" w14:anchorId="4D0CDCEC">
           <v:shape id="_x0000_i1029" type="#_x0000_t75" style="width:75.85pt;height:49.3pt" o:ole="">
-            <v:imagedata r:id="rId20" o:title=""/>
+            <v:imagedata r:id="rId21" o:title=""/>
           </v:shape>
-          <o:OLEObject Type="Embed" ProgID="Package" ShapeID="_x0000_i1029" DrawAspect="Icon" ObjectID="_1831823861" r:id="rId21"/>
+          <o:OLEObject Type="Embed" ProgID="Package" ShapeID="_x0000_i1029" DrawAspect="Icon" ObjectID="_1831824785" r:id="rId22"/>
         </w:object>
       </w:r>
       <w:r>
         <w:object w:dxaOrig="1520" w:dyaOrig="987" w14:anchorId="4E6B4BA4">
           <v:shape id="_x0000_i1031" type="#_x0000_t75" style="width:75.85pt;height:49.3pt" o:ole="">
-            <v:imagedata r:id="rId22" o:title=""/>
+            <v:imagedata r:id="rId23" o:title=""/>
           </v:shape>
-          <o:OLEObject Type="Embed" ProgID="Package" ShapeID="_x0000_i1031" DrawAspect="Icon" ObjectID="_1831823862" r:id="rId23"/>
+          <o:OLEObject Type="Embed" ProgID="Package" ShapeID="_x0000_i1031" DrawAspect="Icon" ObjectID="_1831824786" r:id="rId24"/>
         </w:object>
       </w:r>
       <w:r>
         <w:object w:dxaOrig="1520" w:dyaOrig="987" w14:anchorId="0541ACA5">
           <v:shape id="_x0000_i1030" type="#_x0000_t75" style="width:75.85pt;height:49.3pt" o:ole="">
-            <v:imagedata r:id="rId24" o:title=""/>
+            <v:imagedata r:id="rId25" o:title=""/>
           </v:shape>
-          <o:OLEObject Type="Embed" ProgID="Package" ShapeID="_x0000_i1030" DrawAspect="Icon" ObjectID="_1831823863" r:id="rId25"/>
+          <o:OLEObject Type="Embed" ProgID="Package" ShapeID="_x0000_i1030" DrawAspect="Icon" ObjectID="_1831824787" r:id="rId26"/>
         </w:object>
       </w:r>
     </w:p>
@@ -1231,6 +1289,7 @@
   <w:style w:type="paragraph" w:default="1" w:styleId="Normal">
     <w:name w:val="Normal"/>
     <w:qFormat/>
+    <w:rsid w:val="00D91BE4"/>
   </w:style>
   <w:style w:type="paragraph" w:styleId="Heading1">
     <w:name w:val="heading 1"/>

</xml_diff>

<commit_message>
pending bank configuration added
</commit_message>
<xml_diff>
--- a/Bank_Testing.docx
+++ b/Bank_Testing.docx
@@ -650,7 +650,7 @@
           </mc:Choice>
           <mc:Fallback>
             <w:pict>
-              <v:shapetype w14:anchorId="44A339AD" id="_x0000_t75" coordsize="21600,21600" o:spt="75" o:preferrelative="t" path="m@4@5l@4@11@9@11@9@5xe" filled="f" stroked="f">
+              <v:shapetype w14:anchorId="6944F757" id="_x0000_t75" coordsize="21600,21600" o:spt="75" o:preferrelative="t" path="m@4@5l@4@11@9@11@9@5xe" filled="f" stroked="f">
                 <v:stroke joinstyle="miter"/>
                 <v:formulas>
                   <v:f eqn="if lineDrawn pixelLineWidth 0"/>
@@ -717,32 +717,25 @@
     <w:p/>
     <w:p>
       <w:r>
-        <w:t>DCU : (</w:t>
-      </w:r>
-      <w:r>
-        <w:t>Account is not reading correctly. Regex to be checked</w:t>
+        <w:t>American Heritage</w:t>
+      </w:r>
+      <w:r>
+        <w:t xml:space="preserve"> : (</w:t>
+      </w:r>
+      <w:r>
+        <w:t>Working fine</w:t>
       </w:r>
       <w:r>
         <w:t>)</w:t>
       </w:r>
     </w:p>
     <w:p>
-      <w:pPr>
-        <w:rPr>
-          <w:b/>
-          <w:bCs/>
-        </w:rPr>
-      </w:pPr>
-      <w:r>
-        <w:rPr>
-          <w:b/>
-          <w:bCs/>
-        </w:rPr>
+      <w:r>
         <w:drawing>
-          <wp:inline distT="0" distB="0" distL="0" distR="0" wp14:anchorId="3A80CFE8" wp14:editId="660D8E47">
-            <wp:extent cx="5943600" cy="2625725"/>
-            <wp:effectExtent l="0" t="0" r="0" b="3175"/>
-            <wp:docPr id="249155978" name="Picture 1"/>
+          <wp:inline distT="0" distB="0" distL="0" distR="0" wp14:anchorId="494C7330" wp14:editId="7BFEDCAD">
+            <wp:extent cx="5943600" cy="2606040"/>
+            <wp:effectExtent l="0" t="0" r="0" b="3810"/>
+            <wp:docPr id="1274527048" name="Picture 1"/>
             <wp:cNvGraphicFramePr>
               <a:graphicFrameLocks xmlns:a="http://schemas.openxmlformats.org/drawingml/2006/main" noChangeAspect="1"/>
             </wp:cNvGraphicFramePr>
@@ -750,7 +743,7 @@
               <a:graphicData uri="http://schemas.openxmlformats.org/drawingml/2006/picture">
                 <pic:pic xmlns:pic="http://schemas.openxmlformats.org/drawingml/2006/picture">
                   <pic:nvPicPr>
-                    <pic:cNvPr id="249155978" name=""/>
+                    <pic:cNvPr id="1274527048" name=""/>
                     <pic:cNvPicPr/>
                   </pic:nvPicPr>
                   <pic:blipFill>
@@ -762,7 +755,7 @@
                   <pic:spPr>
                     <a:xfrm>
                       <a:off x="0" y="0"/>
-                      <a:ext cx="5943600" cy="2625725"/>
+                      <a:ext cx="5943600" cy="2606040"/>
                     </a:xfrm>
                     <a:prstGeom prst="rect">
                       <a:avLst/>
@@ -775,6 +768,21 @@
         </w:drawing>
       </w:r>
     </w:p>
+    <w:p/>
+    <w:p/>
+    <w:p/>
+    <w:p>
+      <w:r>
+        <w:lastRenderedPageBreak/>
+        <w:t>DCU : (</w:t>
+      </w:r>
+      <w:r>
+        <w:t>Account split happening, but some unknown splits are happening. To be checked</w:t>
+      </w:r>
+      <w:r>
+        <w:t>)</w:t>
+      </w:r>
+    </w:p>
     <w:p>
       <w:pPr>
         <w:rPr>
@@ -782,39 +790,16 @@
           <w:bCs/>
         </w:rPr>
       </w:pPr>
-    </w:p>
-    <w:p>
-      <w:r>
-        <w:t>Ascent</w:t>
-      </w:r>
-      <w:r>
-        <w:t xml:space="preserve"> : (</w:t>
-      </w:r>
-      <w:r>
-        <w:t>Multi account split not happening based on ID 0000</w:t>
-      </w:r>
-      <w:r>
-        <w:t>)</w:t>
-      </w:r>
-    </w:p>
-    <w:p>
-      <w:pPr>
+      <w:r>
         <w:rPr>
           <w:b/>
           <w:bCs/>
         </w:rPr>
-      </w:pPr>
-      <w:r>
-        <w:rPr>
-          <w:b/>
-          <w:bCs/>
-        </w:rPr>
-        <w:lastRenderedPageBreak/>
         <w:drawing>
-          <wp:inline distT="0" distB="0" distL="0" distR="0" wp14:anchorId="6446ECFD" wp14:editId="112B6A83">
-            <wp:extent cx="5943600" cy="2513965"/>
-            <wp:effectExtent l="0" t="0" r="0" b="635"/>
-            <wp:docPr id="343809820" name="Picture 1"/>
+          <wp:inline distT="0" distB="0" distL="0" distR="0" wp14:anchorId="249A6A3B" wp14:editId="1794F62B">
+            <wp:extent cx="5943600" cy="2687320"/>
+            <wp:effectExtent l="0" t="0" r="0" b="0"/>
+            <wp:docPr id="804592798" name="Picture 1"/>
             <wp:cNvGraphicFramePr>
               <a:graphicFrameLocks xmlns:a="http://schemas.openxmlformats.org/drawingml/2006/main" noChangeAspect="1"/>
             </wp:cNvGraphicFramePr>
@@ -822,7 +807,7 @@
               <a:graphicData uri="http://schemas.openxmlformats.org/drawingml/2006/picture">
                 <pic:pic xmlns:pic="http://schemas.openxmlformats.org/drawingml/2006/picture">
                   <pic:nvPicPr>
-                    <pic:cNvPr id="343809820" name=""/>
+                    <pic:cNvPr id="804592798" name=""/>
                     <pic:cNvPicPr/>
                   </pic:nvPicPr>
                   <pic:blipFill>
@@ -834,7 +819,7 @@
                   <pic:spPr>
                     <a:xfrm>
                       <a:off x="0" y="0"/>
-                      <a:ext cx="5943600" cy="2513965"/>
+                      <a:ext cx="5943600" cy="2687320"/>
                     </a:xfrm>
                     <a:prstGeom prst="rect">
                       <a:avLst/>
@@ -847,6 +832,77 @@
         </w:drawing>
       </w:r>
     </w:p>
+    <w:p>
+      <w:pPr>
+        <w:rPr>
+          <w:b/>
+          <w:bCs/>
+        </w:rPr>
+      </w:pPr>
+    </w:p>
+    <w:p>
+      <w:r>
+        <w:t>Ascent</w:t>
+      </w:r>
+      <w:r>
+        <w:t xml:space="preserve"> : (</w:t>
+      </w:r>
+      <w:r>
+        <w:t>Multi account splitting happening, but unknown split sections are getting created</w:t>
+      </w:r>
+      <w:r>
+        <w:t>)</w:t>
+      </w:r>
+    </w:p>
+    <w:p>
+      <w:pPr>
+        <w:rPr>
+          <w:b/>
+          <w:bCs/>
+        </w:rPr>
+      </w:pPr>
+      <w:r>
+        <w:rPr>
+          <w:b/>
+          <w:bCs/>
+        </w:rPr>
+        <w:drawing>
+          <wp:inline distT="0" distB="0" distL="0" distR="0" wp14:anchorId="148F5E14" wp14:editId="0C8EE5E8">
+            <wp:extent cx="5943600" cy="2662555"/>
+            <wp:effectExtent l="0" t="0" r="0" b="4445"/>
+            <wp:docPr id="1504625910" name="Picture 1"/>
+            <wp:cNvGraphicFramePr>
+              <a:graphicFrameLocks xmlns:a="http://schemas.openxmlformats.org/drawingml/2006/main" noChangeAspect="1"/>
+            </wp:cNvGraphicFramePr>
+            <a:graphic xmlns:a="http://schemas.openxmlformats.org/drawingml/2006/main">
+              <a:graphicData uri="http://schemas.openxmlformats.org/drawingml/2006/picture">
+                <pic:pic xmlns:pic="http://schemas.openxmlformats.org/drawingml/2006/picture">
+                  <pic:nvPicPr>
+                    <pic:cNvPr id="1504625910" name=""/>
+                    <pic:cNvPicPr/>
+                  </pic:nvPicPr>
+                  <pic:blipFill>
+                    <a:blip r:embed="rId21"/>
+                    <a:stretch>
+                      <a:fillRect/>
+                    </a:stretch>
+                  </pic:blipFill>
+                  <pic:spPr>
+                    <a:xfrm>
+                      <a:off x="0" y="0"/>
+                      <a:ext cx="5943600" cy="2662555"/>
+                    </a:xfrm>
+                    <a:prstGeom prst="rect">
+                      <a:avLst/>
+                    </a:prstGeom>
+                  </pic:spPr>
+                </pic:pic>
+              </a:graphicData>
+            </a:graphic>
+          </wp:inline>
+        </w:drawing>
+      </w:r>
+    </w:p>
     <w:p/>
     <w:p>
       <w:r>
@@ -857,25 +913,25 @@
       <w:r>
         <w:object w:dxaOrig="1520" w:dyaOrig="987" w14:anchorId="4D0CDCEC">
           <v:shape id="_x0000_i1029" type="#_x0000_t75" style="width:75.85pt;height:49.3pt" o:ole="">
-            <v:imagedata r:id="rId21" o:title=""/>
+            <v:imagedata r:id="rId22" o:title=""/>
           </v:shape>
-          <o:OLEObject Type="Embed" ProgID="Package" ShapeID="_x0000_i1029" DrawAspect="Icon" ObjectID="_1831824785" r:id="rId22"/>
+          <o:OLEObject Type="Embed" ProgID="Package" ShapeID="_x0000_i1029" DrawAspect="Icon" ObjectID="_1831833708" r:id="rId23"/>
         </w:object>
       </w:r>
       <w:r>
         <w:object w:dxaOrig="1520" w:dyaOrig="987" w14:anchorId="4E6B4BA4">
           <v:shape id="_x0000_i1031" type="#_x0000_t75" style="width:75.85pt;height:49.3pt" o:ole="">
-            <v:imagedata r:id="rId23" o:title=""/>
+            <v:imagedata r:id="rId24" o:title=""/>
           </v:shape>
-          <o:OLEObject Type="Embed" ProgID="Package" ShapeID="_x0000_i1031" DrawAspect="Icon" ObjectID="_1831824786" r:id="rId24"/>
+          <o:OLEObject Type="Embed" ProgID="Package" ShapeID="_x0000_i1031" DrawAspect="Icon" ObjectID="_1831833709" r:id="rId25"/>
         </w:object>
       </w:r>
       <w:r>
         <w:object w:dxaOrig="1520" w:dyaOrig="987" w14:anchorId="0541ACA5">
           <v:shape id="_x0000_i1030" type="#_x0000_t75" style="width:75.85pt;height:49.3pt" o:ole="">
-            <v:imagedata r:id="rId25" o:title=""/>
+            <v:imagedata r:id="rId26" o:title=""/>
           </v:shape>
-          <o:OLEObject Type="Embed" ProgID="Package" ShapeID="_x0000_i1030" DrawAspect="Icon" ObjectID="_1831824787" r:id="rId26"/>
+          <o:OLEObject Type="Embed" ProgID="Package" ShapeID="_x0000_i1030" DrawAspect="Icon" ObjectID="_1831833710" r:id="rId27"/>
         </w:object>
       </w:r>
     </w:p>

</xml_diff>

<commit_message>
dedplicate commented due to issues
</commit_message>
<xml_diff>
--- a/Bank_Testing.docx
+++ b/Bank_Testing.docx
@@ -5,11 +5,22 @@
     <w:p/>
     <w:p>
       <w:r>
-        <w:t>Lili Bank: (fee to be separated)</w:t>
-      </w:r>
-    </w:p>
-    <w:p>
-      <w:r>
+        <w:t>Lili Bank: (</w:t>
+      </w:r>
+      <w:proofErr w:type="gramStart"/>
+      <w:r>
+        <w:t>fee</w:t>
+      </w:r>
+      <w:proofErr w:type="gramEnd"/>
+      <w:r>
+        <w:t xml:space="preserve"> to be separated)</w:t>
+      </w:r>
+    </w:p>
+    <w:p>
+      <w:r>
+        <w:rPr>
+          <w:noProof/>
+        </w:rPr>
         <w:drawing>
           <wp:inline distT="0" distB="0" distL="0" distR="0" wp14:anchorId="77D36785" wp14:editId="043741C5">
             <wp:extent cx="5943600" cy="2642870"/>
@@ -56,6 +67,9 @@
     </w:p>
     <w:p>
       <w:r>
+        <w:rPr>
+          <w:noProof/>
+        </w:rPr>
         <w:drawing>
           <wp:inline distT="0" distB="0" distL="0" distR="0" wp14:anchorId="1B88EC3A" wp14:editId="50F57AAF">
             <wp:extent cx="5943600" cy="2646045"/>
@@ -97,9 +111,14 @@
     <w:p/>
     <w:p/>
     <w:p>
+      <w:proofErr w:type="gramStart"/>
       <w:r>
         <w:lastRenderedPageBreak/>
-        <w:t xml:space="preserve">Trustco(sometimes mismatch in debit and interest amount to be </w:t>
+        <w:t>Trustco(</w:t>
+      </w:r>
+      <w:proofErr w:type="gramEnd"/>
+      <w:r>
+        <w:t xml:space="preserve">sometimes mismatch in debit and interest amount to be </w:t>
       </w:r>
       <w:r>
         <w:t>separated</w:t>
@@ -110,6 +129,9 @@
     </w:p>
     <w:p>
       <w:r>
+        <w:rPr>
+          <w:noProof/>
+        </w:rPr>
         <w:drawing>
           <wp:inline distT="0" distB="0" distL="0" distR="0" wp14:anchorId="1F3455C1" wp14:editId="474D3419">
             <wp:extent cx="5943600" cy="2623820"/>
@@ -153,7 +175,15 @@
     <w:p/>
     <w:p>
       <w:r>
-        <w:t xml:space="preserve">Sun Coast (single account working , multi account </w:t>
+        <w:t xml:space="preserve">Sun Coast (single account </w:t>
+      </w:r>
+      <w:proofErr w:type="gramStart"/>
+      <w:r>
+        <w:t>working ,</w:t>
+      </w:r>
+      <w:proofErr w:type="gramEnd"/>
+      <w:r>
+        <w:t xml:space="preserve"> multi account </w:t>
       </w:r>
       <w:r>
         <w:t>not splitting by Suffix regex</w:t>
@@ -164,6 +194,9 @@
     </w:p>
     <w:p>
       <w:r>
+        <w:rPr>
+          <w:noProof/>
+        </w:rPr>
         <w:drawing>
           <wp:inline distT="0" distB="0" distL="0" distR="0" wp14:anchorId="12C7E3AF" wp14:editId="21AC510C">
             <wp:extent cx="5943600" cy="2520315"/>
@@ -218,6 +251,9 @@
     </w:p>
     <w:p>
       <w:r>
+        <w:rPr>
+          <w:noProof/>
+        </w:rPr>
         <w:drawing>
           <wp:inline distT="0" distB="0" distL="0" distR="0" wp14:anchorId="1AA5BA3C" wp14:editId="7B308A3A">
             <wp:extent cx="5943600" cy="2637790"/>
@@ -258,17 +294,14 @@
     <w:p/>
     <w:p>
       <w:r>
-        <w:t>Numerica (</w:t>
-      </w:r>
-      <w:r>
-        <w:t>Single account working</w:t>
-      </w:r>
-      <w:r>
-        <w:t>)</w:t>
-      </w:r>
-    </w:p>
-    <w:p>
-      <w:r>
+        <w:t>Numerica (Single account working)</w:t>
+      </w:r>
+    </w:p>
+    <w:p>
+      <w:r>
+        <w:rPr>
+          <w:noProof/>
+        </w:rPr>
         <w:drawing>
           <wp:inline distT="0" distB="0" distL="0" distR="0" wp14:anchorId="16C763E8" wp14:editId="7F893F42">
             <wp:extent cx="5943600" cy="2632710"/>
@@ -320,6 +353,9 @@
     </w:p>
     <w:p>
       <w:r>
+        <w:rPr>
+          <w:noProof/>
+        </w:rPr>
         <w:drawing>
           <wp:inline distT="0" distB="0" distL="0" distR="0" wp14:anchorId="51098AE7" wp14:editId="1B1C111B">
             <wp:extent cx="5943600" cy="2637155"/>
@@ -365,6 +401,9 @@
     </w:p>
     <w:p>
       <w:r>
+        <w:rPr>
+          <w:noProof/>
+        </w:rPr>
         <w:drawing>
           <wp:inline distT="0" distB="0" distL="0" distR="0" wp14:anchorId="241C653A" wp14:editId="279DFA20">
             <wp:extent cx="5943600" cy="2701290"/>
@@ -412,6 +451,9 @@
         <w:br/>
       </w:r>
       <w:r>
+        <w:rPr>
+          <w:noProof/>
+        </w:rPr>
         <w:drawing>
           <wp:inline distT="0" distB="0" distL="0" distR="0" wp14:anchorId="0FC25861" wp14:editId="6EFDEA21">
             <wp:extent cx="5943600" cy="2682875"/>
@@ -460,6 +502,9 @@
     </w:p>
     <w:p>
       <w:r>
+        <w:rPr>
+          <w:noProof/>
+        </w:rPr>
         <w:drawing>
           <wp:inline distT="0" distB="0" distL="0" distR="0" wp14:anchorId="2ECF2FEE" wp14:editId="6FE66D3E">
             <wp:extent cx="5943600" cy="2592070"/>
@@ -504,15 +549,20 @@
     <w:p/>
     <w:p/>
     <w:p>
+      <w:proofErr w:type="spellStart"/>
       <w:r>
         <w:t>Americu</w:t>
       </w:r>
+      <w:proofErr w:type="spellEnd"/>
       <w:r>
         <w:t xml:space="preserve"> (debit credit mismatch to be checked)</w:t>
       </w:r>
     </w:p>
     <w:p>
       <w:r>
+        <w:rPr>
+          <w:noProof/>
+        </w:rPr>
         <w:drawing>
           <wp:inline distT="0" distB="0" distL="0" distR="0" wp14:anchorId="62DD16B8" wp14:editId="2F73ED3C">
             <wp:extent cx="5943600" cy="2693670"/>
@@ -553,11 +603,22 @@
     <w:p/>
     <w:p>
       <w:r>
-        <w:t>Middle Town Valley(Debit credit mismatch due to long description)</w:t>
-      </w:r>
-    </w:p>
-    <w:p>
-      <w:r>
+        <w:t xml:space="preserve">Middle Town </w:t>
+      </w:r>
+      <w:proofErr w:type="gramStart"/>
+      <w:r>
+        <w:t>Valley(</w:t>
+      </w:r>
+      <w:proofErr w:type="gramEnd"/>
+      <w:r>
+        <w:t>Debit credit mismatch due to long description)</w:t>
+      </w:r>
+    </w:p>
+    <w:p>
+      <w:r>
+        <w:rPr>
+          <w:noProof/>
+        </w:rPr>
         <w:drawing>
           <wp:inline distT="0" distB="0" distL="0" distR="0" wp14:anchorId="42A8AC5A" wp14:editId="73759555">
             <wp:extent cx="5943600" cy="2606040"/>
@@ -677,6 +738,9 @@
         </mc:AlternateContent>
       </w:r>
       <w:r>
+        <w:rPr>
+          <w:noProof/>
+        </w:rPr>
         <w:drawing>
           <wp:inline distT="0" distB="0" distL="0" distR="0" wp14:anchorId="6FE38DA3" wp14:editId="7EB90224">
             <wp:extent cx="5943600" cy="2538730"/>
@@ -717,10 +781,15 @@
     <w:p/>
     <w:p>
       <w:r>
-        <w:t>American Heritage</w:t>
-      </w:r>
-      <w:r>
-        <w:t xml:space="preserve"> : (</w:t>
+        <w:t xml:space="preserve">American </w:t>
+      </w:r>
+      <w:proofErr w:type="gramStart"/>
+      <w:r>
+        <w:t>Heritage :</w:t>
+      </w:r>
+      <w:proofErr w:type="gramEnd"/>
+      <w:r>
+        <w:t xml:space="preserve"> (</w:t>
       </w:r>
       <w:r>
         <w:t>Working fine</w:t>
@@ -731,6 +800,9 @@
     </w:p>
     <w:p>
       <w:r>
+        <w:rPr>
+          <w:noProof/>
+        </w:rPr>
         <w:drawing>
           <wp:inline distT="0" distB="0" distL="0" distR="0" wp14:anchorId="494C7330" wp14:editId="7BFEDCAD">
             <wp:extent cx="5943600" cy="2606040"/>
@@ -772,9 +844,14 @@
     <w:p/>
     <w:p/>
     <w:p>
+      <w:proofErr w:type="gramStart"/>
       <w:r>
         <w:lastRenderedPageBreak/>
-        <w:t>DCU : (</w:t>
+        <w:t>DCU :</w:t>
+      </w:r>
+      <w:proofErr w:type="gramEnd"/>
+      <w:r>
+        <w:t xml:space="preserve"> (</w:t>
       </w:r>
       <w:r>
         <w:t>Account split happening, but some unknown splits are happening. To be checked</w:t>
@@ -794,6 +871,7 @@
         <w:rPr>
           <w:b/>
           <w:bCs/>
+          <w:noProof/>
         </w:rPr>
         <w:drawing>
           <wp:inline distT="0" distB="0" distL="0" distR="0" wp14:anchorId="249A6A3B" wp14:editId="1794F62B">
@@ -841,11 +919,13 @@
       </w:pPr>
     </w:p>
     <w:p>
-      <w:r>
-        <w:t>Ascent</w:t>
-      </w:r>
-      <w:r>
-        <w:t xml:space="preserve"> : (</w:t>
+      <w:proofErr w:type="gramStart"/>
+      <w:r>
+        <w:t>Ascent :</w:t>
+      </w:r>
+      <w:proofErr w:type="gramEnd"/>
+      <w:r>
+        <w:t xml:space="preserve"> (</w:t>
       </w:r>
       <w:r>
         <w:t>Multi account splitting happening, but unknown split sections are getting created</w:t>
@@ -865,6 +945,7 @@
         <w:rPr>
           <w:b/>
           <w:bCs/>
+          <w:noProof/>
         </w:rPr>
         <w:drawing>
           <wp:inline distT="0" distB="0" distL="0" distR="0" wp14:anchorId="148F5E14" wp14:editId="0C8EE5E8">
@@ -904,6 +985,80 @@
       </w:r>
     </w:p>
     <w:p/>
+    <w:p/>
+    <w:p/>
+    <w:p/>
+    <w:p>
+      <w:proofErr w:type="spellStart"/>
+      <w:proofErr w:type="gramStart"/>
+      <w:r>
+        <w:lastRenderedPageBreak/>
+        <w:t>Wafd</w:t>
+      </w:r>
+      <w:proofErr w:type="spellEnd"/>
+      <w:r>
+        <w:t xml:space="preserve"> :</w:t>
+      </w:r>
+      <w:proofErr w:type="gramEnd"/>
+      <w:r>
+        <w:t xml:space="preserve"> (</w:t>
+      </w:r>
+      <w:r>
+        <w:t xml:space="preserve">Working but here there are other categories like other transactions which </w:t>
+      </w:r>
+      <w:proofErr w:type="gramStart"/>
+      <w:r>
+        <w:t>needs</w:t>
+      </w:r>
+      <w:proofErr w:type="gramEnd"/>
+      <w:r>
+        <w:t xml:space="preserve"> code change</w:t>
+      </w:r>
+      <w:r>
+        <w:t>)</w:t>
+      </w:r>
+    </w:p>
+    <w:p>
+      <w:r>
+        <w:drawing>
+          <wp:inline distT="0" distB="0" distL="0" distR="0" wp14:anchorId="06B1DD52" wp14:editId="59EBB766">
+            <wp:extent cx="5943600" cy="2435225"/>
+            <wp:effectExtent l="0" t="0" r="0" b="3175"/>
+            <wp:docPr id="1347816934" name="Picture 1"/>
+            <wp:cNvGraphicFramePr>
+              <a:graphicFrameLocks xmlns:a="http://schemas.openxmlformats.org/drawingml/2006/main" noChangeAspect="1"/>
+            </wp:cNvGraphicFramePr>
+            <a:graphic xmlns:a="http://schemas.openxmlformats.org/drawingml/2006/main">
+              <a:graphicData uri="http://schemas.openxmlformats.org/drawingml/2006/picture">
+                <pic:pic xmlns:pic="http://schemas.openxmlformats.org/drawingml/2006/picture">
+                  <pic:nvPicPr>
+                    <pic:cNvPr id="1347816934" name=""/>
+                    <pic:cNvPicPr/>
+                  </pic:nvPicPr>
+                  <pic:blipFill>
+                    <a:blip r:embed="rId22"/>
+                    <a:stretch>
+                      <a:fillRect/>
+                    </a:stretch>
+                  </pic:blipFill>
+                  <pic:spPr>
+                    <a:xfrm>
+                      <a:off x="0" y="0"/>
+                      <a:ext cx="5943600" cy="2435225"/>
+                    </a:xfrm>
+                    <a:prstGeom prst="rect">
+                      <a:avLst/>
+                    </a:prstGeom>
+                  </pic:spPr>
+                </pic:pic>
+              </a:graphicData>
+            </a:graphic>
+          </wp:inline>
+        </w:drawing>
+      </w:r>
+    </w:p>
+    <w:p/>
+    <w:p/>
     <w:p>
       <w:r>
         <w:t>Code</w:t>
@@ -912,26 +1067,45 @@
     <w:p>
       <w:r>
         <w:object w:dxaOrig="1520" w:dyaOrig="987" w14:anchorId="4D0CDCEC">
-          <v:shape id="_x0000_i1029" type="#_x0000_t75" style="width:75.85pt;height:49.3pt" o:ole="">
-            <v:imagedata r:id="rId22" o:title=""/>
+          <v:shapetype id="_x0000_t75" coordsize="21600,21600" o:spt="75" o:preferrelative="t" path="m@4@5l@4@11@9@11@9@5xe" filled="f" stroked="f">
+            <v:stroke joinstyle="miter"/>
+            <v:formulas>
+              <v:f eqn="if lineDrawn pixelLineWidth 0"/>
+              <v:f eqn="sum @0 1 0"/>
+              <v:f eqn="sum 0 0 @1"/>
+              <v:f eqn="prod @2 1 2"/>
+              <v:f eqn="prod @3 21600 pixelWidth"/>
+              <v:f eqn="prod @3 21600 pixelHeight"/>
+              <v:f eqn="sum @0 0 1"/>
+              <v:f eqn="prod @6 1 2"/>
+              <v:f eqn="prod @7 21600 pixelWidth"/>
+              <v:f eqn="sum @8 21600 0"/>
+              <v:f eqn="prod @7 21600 pixelHeight"/>
+              <v:f eqn="sum @10 21600 0"/>
+            </v:formulas>
+            <v:path o:extrusionok="f" gradientshapeok="t" o:connecttype="rect"/>
+            <o:lock v:ext="edit" aspectratio="t"/>
+          </v:shapetype>
+          <v:shape id="_x0000_i1025" type="#_x0000_t75" style="width:75.85pt;height:49.3pt" o:ole="">
+            <v:imagedata r:id="rId23" o:title=""/>
           </v:shape>
-          <o:OLEObject Type="Embed" ProgID="Package" ShapeID="_x0000_i1029" DrawAspect="Icon" ObjectID="_1831833708" r:id="rId23"/>
+          <o:OLEObject Type="Embed" ProgID="Package" ShapeID="_x0000_i1025" DrawAspect="Icon" ObjectID="_1832187246" r:id="rId24"/>
         </w:object>
       </w:r>
       <w:r>
         <w:object w:dxaOrig="1520" w:dyaOrig="987" w14:anchorId="4E6B4BA4">
-          <v:shape id="_x0000_i1031" type="#_x0000_t75" style="width:75.85pt;height:49.3pt" o:ole="">
-            <v:imagedata r:id="rId24" o:title=""/>
+          <v:shape id="_x0000_i1026" type="#_x0000_t75" style="width:75.85pt;height:49.3pt" o:ole="">
+            <v:imagedata r:id="rId25" o:title=""/>
           </v:shape>
-          <o:OLEObject Type="Embed" ProgID="Package" ShapeID="_x0000_i1031" DrawAspect="Icon" ObjectID="_1831833709" r:id="rId25"/>
+          <o:OLEObject Type="Embed" ProgID="Package" ShapeID="_x0000_i1026" DrawAspect="Icon" ObjectID="_1832187247" r:id="rId26"/>
         </w:object>
       </w:r>
       <w:r>
         <w:object w:dxaOrig="1520" w:dyaOrig="987" w14:anchorId="0541ACA5">
-          <v:shape id="_x0000_i1030" type="#_x0000_t75" style="width:75.85pt;height:49.3pt" o:ole="">
-            <v:imagedata r:id="rId26" o:title=""/>
+          <v:shape id="_x0000_i1027" type="#_x0000_t75" style="width:75.85pt;height:49.3pt" o:ole="">
+            <v:imagedata r:id="rId27" o:title=""/>
           </v:shape>
-          <o:OLEObject Type="Embed" ProgID="Package" ShapeID="_x0000_i1030" DrawAspect="Icon" ObjectID="_1831833710" r:id="rId27"/>
+          <o:OLEObject Type="Embed" ProgID="Package" ShapeID="_x0000_i1027" DrawAspect="Icon" ObjectID="_1832187248" r:id="rId28"/>
         </w:object>
       </w:r>
     </w:p>
@@ -1345,7 +1519,7 @@
   <w:style w:type="paragraph" w:default="1" w:styleId="Normal">
     <w:name w:val="Normal"/>
     <w:qFormat/>
-    <w:rsid w:val="00D91BE4"/>
+    <w:rsid w:val="006069D4"/>
   </w:style>
   <w:style w:type="paragraph" w:styleId="Heading1">
     <w:name w:val="heading 1"/>

</xml_diff>